<commit_message>
analiz ve teknik dokumantasyon eklendi
</commit_message>
<xml_diff>
--- a/26_Teknik_Analiz_Dokumani.docx
+++ b/26_Teknik_Analiz_Dokumani.docx
@@ -18,36 +18,8 @@
           <w:color w:val="000000"/>
           <w:sz w:val="28"/>
         </w:rPr>
-        <w:t xml:space="preserve">Pelinsu Kahraman - </w:t>
+        <w:t>Pelinsu Kahraman - Bilgisayar Mühendisliği</w:t>
       </w:r>
-      <w:proofErr w:type="spellStart"/>
-      <w:r>
-        <w:rPr>
-          <w:b/>
-          <w:color w:val="000000"/>
-          <w:sz w:val="28"/>
-        </w:rPr>
-        <w:t>Bilgisayar</w:t>
-      </w:r>
-      <w:proofErr w:type="spellEnd"/>
-      <w:r>
-        <w:rPr>
-          <w:b/>
-          <w:color w:val="000000"/>
-          <w:sz w:val="28"/>
-        </w:rPr>
-        <w:t xml:space="preserve"> </w:t>
-      </w:r>
-      <w:proofErr w:type="spellStart"/>
-      <w:r>
-        <w:rPr>
-          <w:b/>
-          <w:color w:val="000000"/>
-          <w:sz w:val="28"/>
-        </w:rPr>
-        <w:t>Mühendisliği</w:t>
-      </w:r>
-      <w:proofErr w:type="spellEnd"/>
     </w:p>
     <w:p/>
     <w:p/>
@@ -55,34 +27,14 @@
       <w:pPr>
         <w:jc w:val="center"/>
       </w:pPr>
-      <w:proofErr w:type="spellStart"/>
       <w:r>
         <w:rPr>
           <w:b/>
           <w:color w:val="000000"/>
           <w:sz w:val="40"/>
         </w:rPr>
-        <w:t>Finansal</w:t>
+        <w:t>Finansal Portalı</w:t>
       </w:r>
-      <w:proofErr w:type="spellEnd"/>
-      <w:r>
-        <w:rPr>
-          <w:b/>
-          <w:color w:val="000000"/>
-          <w:sz w:val="40"/>
-        </w:rPr>
-        <w:t xml:space="preserve"> </w:t>
-      </w:r>
-      <w:proofErr w:type="spellStart"/>
-      <w:r>
-        <w:rPr>
-          <w:b/>
-          <w:color w:val="000000"/>
-          <w:sz w:val="40"/>
-        </w:rPr>
-        <w:t>Portalı</w:t>
-      </w:r>
-      <w:proofErr w:type="spellEnd"/>
     </w:p>
     <w:p>
       <w:pPr>
@@ -121,23 +73,13 @@
       <w:pPr>
         <w:jc w:val="center"/>
       </w:pPr>
-      <w:proofErr w:type="spellStart"/>
       <w:r>
         <w:rPr>
           <w:b/>
           <w:color w:val="000000"/>
           <w:sz w:val="24"/>
         </w:rPr>
-        <w:t>Öğrenci</w:t>
-      </w:r>
-      <w:proofErr w:type="spellEnd"/>
-      <w:r>
-        <w:rPr>
-          <w:b/>
-          <w:color w:val="000000"/>
-          <w:sz w:val="24"/>
-        </w:rPr>
-        <w:t xml:space="preserve"> No: </w:t>
+        <w:t xml:space="preserve">Öğrenci No: </w:t>
       </w:r>
       <w:r>
         <w:rPr>
@@ -445,21 +387,12 @@
                 <w:color w:val="000000" w:themeColor="text1"/>
               </w:rPr>
             </w:pPr>
-            <w:proofErr w:type="gramStart"/>
             <w:r>
               <w:rPr>
                 <w:color w:val="000000" w:themeColor="text1"/>
                 <w:sz w:val="20"/>
               </w:rPr>
-              <w:t>nginx:alpine</w:t>
-            </w:r>
-            <w:proofErr w:type="gramEnd"/>
-            <w:r>
-              <w:rPr>
-                <w:color w:val="000000" w:themeColor="text1"/>
-                <w:sz w:val="20"/>
-              </w:rPr>
-              <w:t xml:space="preserve"> (özel build)</w:t>
+              <w:t>nginx:alpine (özel build)</w:t>
             </w:r>
           </w:p>
         </w:tc>
@@ -1075,7 +1008,6 @@
                 <w:color w:val="000000" w:themeColor="text1"/>
               </w:rPr>
             </w:pPr>
-            <w:proofErr w:type="spellStart"/>
             <w:r>
               <w:rPr>
                 <w:color w:val="000000" w:themeColor="text1"/>
@@ -1083,7 +1015,6 @@
               </w:rPr>
               <w:t>prometheus</w:t>
             </w:r>
-            <w:proofErr w:type="spellEnd"/>
           </w:p>
         </w:tc>
         <w:tc>
@@ -1101,17 +1032,8 @@
                 <w:color w:val="000000" w:themeColor="text1"/>
                 <w:sz w:val="20"/>
               </w:rPr>
-              <w:t>prom/</w:t>
-            </w:r>
-            <w:proofErr w:type="gramStart"/>
-            <w:r>
-              <w:rPr>
-                <w:color w:val="000000" w:themeColor="text1"/>
-                <w:sz w:val="20"/>
-              </w:rPr>
-              <w:t>prometheus:latest</w:t>
-            </w:r>
-            <w:proofErr w:type="gramEnd"/>
+              <w:t>prom/prometheus:latest</w:t>
+            </w:r>
           </w:p>
         </w:tc>
         <w:tc>
@@ -1165,7 +1087,6 @@
                 <w:color w:val="000000" w:themeColor="text1"/>
               </w:rPr>
             </w:pPr>
-            <w:proofErr w:type="spellStart"/>
             <w:r>
               <w:rPr>
                 <w:color w:val="000000" w:themeColor="text1"/>
@@ -1173,7 +1094,6 @@
               </w:rPr>
               <w:t>grafana</w:t>
             </w:r>
-            <w:proofErr w:type="spellEnd"/>
           </w:p>
         </w:tc>
         <w:tc>
@@ -1192,17 +1112,8 @@
                 <w:color w:val="000000" w:themeColor="text1"/>
                 <w:sz w:val="20"/>
               </w:rPr>
-              <w:t>grafana/</w:t>
-            </w:r>
-            <w:proofErr w:type="gramStart"/>
-            <w:r>
-              <w:rPr>
-                <w:color w:val="000000" w:themeColor="text1"/>
-                <w:sz w:val="20"/>
-              </w:rPr>
-              <w:t>grafana:latest</w:t>
-            </w:r>
-            <w:proofErr w:type="gramEnd"/>
+              <w:t>grafana/grafana:latest</w:t>
+            </w:r>
           </w:p>
         </w:tc>
         <w:tc>
@@ -1270,30 +1181,8 @@
         <w:rPr>
           <w:rFonts w:ascii="Arial" w:hAnsi="Arial"/>
         </w:rPr>
-        <w:t xml:space="preserve">2.3 </w:t>
+        <w:t>2.3 Ağ Tasarımı</w:t>
       </w:r>
-      <w:proofErr w:type="spellStart"/>
-      <w:r>
-        <w:rPr>
-          <w:rFonts w:ascii="Arial" w:hAnsi="Arial"/>
-        </w:rPr>
-        <w:t>Ağ</w:t>
-      </w:r>
-      <w:proofErr w:type="spellEnd"/>
-      <w:r>
-        <w:rPr>
-          <w:rFonts w:ascii="Arial" w:hAnsi="Arial"/>
-        </w:rPr>
-        <w:t xml:space="preserve"> </w:t>
-      </w:r>
-      <w:proofErr w:type="spellStart"/>
-      <w:r>
-        <w:rPr>
-          <w:rFonts w:ascii="Arial" w:hAnsi="Arial"/>
-        </w:rPr>
-        <w:t>Tasarımı</w:t>
-      </w:r>
-      <w:proofErr w:type="spellEnd"/>
     </w:p>
     <w:p>
       <w:pPr>
@@ -2727,21 +2616,12 @@
                 <w:color w:val="auto"/>
               </w:rPr>
             </w:pPr>
-            <w:proofErr w:type="gramStart"/>
-            <w:r>
-              <w:rPr>
-                <w:color w:val="auto"/>
-                <w:sz w:val="20"/>
-              </w:rPr>
-              <w:t>VARCHAR(</w:t>
-            </w:r>
-            <w:proofErr w:type="gramEnd"/>
-            <w:r>
-              <w:rPr>
-                <w:color w:val="auto"/>
-                <w:sz w:val="20"/>
-              </w:rPr>
-              <w:t>20) NOT NULL</w:t>
+            <w:r>
+              <w:rPr>
+                <w:color w:val="auto"/>
+                <w:sz w:val="20"/>
+              </w:rPr>
+              <w:t>VARCHAR(20) NOT NULL</w:t>
             </w:r>
           </w:p>
         </w:tc>
@@ -2795,21 +2675,12 @@
                 <w:color w:val="auto"/>
               </w:rPr>
             </w:pPr>
-            <w:proofErr w:type="gramStart"/>
-            <w:r>
-              <w:rPr>
-                <w:color w:val="auto"/>
-                <w:sz w:val="20"/>
-              </w:rPr>
-              <w:t>VARCHAR(</w:t>
-            </w:r>
-            <w:proofErr w:type="gramEnd"/>
-            <w:r>
-              <w:rPr>
-                <w:color w:val="auto"/>
-                <w:sz w:val="20"/>
-              </w:rPr>
-              <w:t>10)</w:t>
+            <w:r>
+              <w:rPr>
+                <w:color w:val="auto"/>
+                <w:sz w:val="20"/>
+              </w:rPr>
+              <w:t>VARCHAR(10)</w:t>
             </w:r>
           </w:p>
         </w:tc>
@@ -2863,21 +2734,12 @@
                 <w:color w:val="auto"/>
               </w:rPr>
             </w:pPr>
-            <w:proofErr w:type="gramStart"/>
-            <w:r>
-              <w:rPr>
-                <w:color w:val="auto"/>
-                <w:sz w:val="20"/>
-              </w:rPr>
-              <w:t>DECIMAL(</w:t>
-            </w:r>
-            <w:proofErr w:type="gramEnd"/>
-            <w:r>
-              <w:rPr>
-                <w:color w:val="auto"/>
-                <w:sz w:val="20"/>
-              </w:rPr>
-              <w:t>18,4)</w:t>
+            <w:r>
+              <w:rPr>
+                <w:color w:val="auto"/>
+                <w:sz w:val="20"/>
+              </w:rPr>
+              <w:t>DECIMAL(18,4)</w:t>
             </w:r>
           </w:p>
         </w:tc>
@@ -2931,21 +2793,12 @@
                 <w:color w:val="auto"/>
               </w:rPr>
             </w:pPr>
-            <w:proofErr w:type="gramStart"/>
-            <w:r>
-              <w:rPr>
-                <w:color w:val="auto"/>
-                <w:sz w:val="20"/>
-              </w:rPr>
-              <w:t>DECIMAL(</w:t>
-            </w:r>
-            <w:proofErr w:type="gramEnd"/>
-            <w:r>
-              <w:rPr>
-                <w:color w:val="auto"/>
-                <w:sz w:val="20"/>
-              </w:rPr>
-              <w:t>18,4)</w:t>
+            <w:r>
+              <w:rPr>
+                <w:color w:val="auto"/>
+                <w:sz w:val="20"/>
+              </w:rPr>
+              <w:t>DECIMAL(18,4)</w:t>
             </w:r>
           </w:p>
         </w:tc>
@@ -2999,21 +2852,12 @@
                 <w:color w:val="auto"/>
               </w:rPr>
             </w:pPr>
-            <w:proofErr w:type="gramStart"/>
-            <w:r>
-              <w:rPr>
-                <w:color w:val="auto"/>
-                <w:sz w:val="20"/>
-              </w:rPr>
-              <w:t>DECIMAL(</w:t>
-            </w:r>
-            <w:proofErr w:type="gramEnd"/>
-            <w:r>
-              <w:rPr>
-                <w:color w:val="auto"/>
-                <w:sz w:val="20"/>
-              </w:rPr>
-              <w:t>8,4)</w:t>
+            <w:r>
+              <w:rPr>
+                <w:color w:val="auto"/>
+                <w:sz w:val="20"/>
+              </w:rPr>
+              <w:t>DECIMAL(8,4)</w:t>
             </w:r>
           </w:p>
         </w:tc>
@@ -3192,7 +3036,6 @@
                 <w:color w:val="auto"/>
               </w:rPr>
             </w:pPr>
-            <w:proofErr w:type="spellStart"/>
             <w:r>
               <w:rPr>
                 <w:b/>
@@ -3200,7 +3043,6 @@
               </w:rPr>
               <w:t>Sütun</w:t>
             </w:r>
-            <w:proofErr w:type="spellEnd"/>
           </w:p>
         </w:tc>
         <w:tc>
@@ -3390,21 +3232,12 @@
                 <w:color w:val="auto"/>
               </w:rPr>
             </w:pPr>
-            <w:proofErr w:type="gramStart"/>
-            <w:r>
-              <w:rPr>
-                <w:color w:val="auto"/>
-                <w:sz w:val="20"/>
-              </w:rPr>
-              <w:t>VARCHAR(</w:t>
-            </w:r>
-            <w:proofErr w:type="gramEnd"/>
-            <w:r>
-              <w:rPr>
-                <w:color w:val="auto"/>
-                <w:sz w:val="20"/>
-              </w:rPr>
-              <w:t>200)</w:t>
+            <w:r>
+              <w:rPr>
+                <w:color w:val="auto"/>
+                <w:sz w:val="20"/>
+              </w:rPr>
+              <w:t>VARCHAR(200)</w:t>
             </w:r>
           </w:p>
         </w:tc>
@@ -3458,21 +3291,12 @@
                 <w:color w:val="auto"/>
               </w:rPr>
             </w:pPr>
-            <w:proofErr w:type="gramStart"/>
-            <w:r>
-              <w:rPr>
-                <w:color w:val="auto"/>
-                <w:sz w:val="20"/>
-              </w:rPr>
-              <w:t>VARCHAR(</w:t>
-            </w:r>
-            <w:proofErr w:type="gramEnd"/>
-            <w:r>
-              <w:rPr>
-                <w:color w:val="auto"/>
-                <w:sz w:val="20"/>
-              </w:rPr>
-              <w:t>20)</w:t>
+            <w:r>
+              <w:rPr>
+                <w:color w:val="auto"/>
+                <w:sz w:val="20"/>
+              </w:rPr>
+              <w:t>VARCHAR(20)</w:t>
             </w:r>
           </w:p>
         </w:tc>
@@ -3677,6 +3501,9 @@
     <w:p>
       <w:pPr>
         <w:pStyle w:val="Balk3"/>
+        <w:rPr>
+          <w:rFonts w:ascii="Arial" w:hAnsi="Arial"/>
+        </w:rPr>
       </w:pPr>
       <w:r>
         <w:rPr>
@@ -3684,14 +3511,20 @@
         </w:rPr>
         <w:br w:type="textWrapping" w:clear="all"/>
       </w:r>
-      <w:proofErr w:type="spellStart"/>
+    </w:p>
+    <w:p>
+      <w:pPr>
+        <w:pStyle w:val="Balk3"/>
+        <w:rPr>
+          <w:rFonts w:ascii="Arial" w:hAnsi="Arial"/>
+        </w:rPr>
+      </w:pPr>
       <w:r>
         <w:rPr>
           <w:rFonts w:ascii="Arial" w:hAnsi="Arial"/>
         </w:rPr>
         <w:t>chat_mesajlari</w:t>
       </w:r>
-      <w:proofErr w:type="spellEnd"/>
     </w:p>
     <w:tbl>
       <w:tblPr>
@@ -3911,21 +3744,12 @@
                 <w:color w:val="auto"/>
               </w:rPr>
             </w:pPr>
-            <w:proofErr w:type="gramStart"/>
-            <w:r>
-              <w:rPr>
-                <w:color w:val="auto"/>
-                <w:sz w:val="20"/>
-              </w:rPr>
-              <w:t>VARCHAR(</w:t>
-            </w:r>
-            <w:proofErr w:type="gramEnd"/>
-            <w:r>
-              <w:rPr>
-                <w:color w:val="auto"/>
-                <w:sz w:val="20"/>
-              </w:rPr>
-              <w:t>10)</w:t>
+            <w:r>
+              <w:rPr>
+                <w:color w:val="auto"/>
+                <w:sz w:val="20"/>
+              </w:rPr>
+              <w:t>VARCHAR(10)</w:t>
             </w:r>
           </w:p>
         </w:tc>
@@ -3965,6 +3789,7 @@
                 <w:color w:val="auto"/>
                 <w:sz w:val="20"/>
               </w:rPr>
+              <w:lastRenderedPageBreak/>
               <w:t>icerik</w:t>
             </w:r>
           </w:p>
@@ -4077,7 +3902,6 @@
               <w:rPr>
                 <w:sz w:val="20"/>
               </w:rPr>
-              <w:lastRenderedPageBreak/>
               <w:t>anomalies</w:t>
             </w:r>
           </w:p>
@@ -4290,30 +4114,8 @@
         <w:rPr>
           <w:rFonts w:ascii="Arial" w:hAnsi="Arial"/>
         </w:rPr>
-        <w:t xml:space="preserve">4.3 </w:t>
+        <w:t>4.3 İndeks Stratejisi</w:t>
       </w:r>
-      <w:proofErr w:type="spellStart"/>
-      <w:r>
-        <w:rPr>
-          <w:rFonts w:ascii="Arial" w:hAnsi="Arial"/>
-        </w:rPr>
-        <w:t>İndeks</w:t>
-      </w:r>
-      <w:proofErr w:type="spellEnd"/>
-      <w:r>
-        <w:rPr>
-          <w:rFonts w:ascii="Arial" w:hAnsi="Arial"/>
-        </w:rPr>
-        <w:t xml:space="preserve"> </w:t>
-      </w:r>
-      <w:proofErr w:type="spellStart"/>
-      <w:r>
-        <w:rPr>
-          <w:rFonts w:ascii="Arial" w:hAnsi="Arial"/>
-        </w:rPr>
-        <w:t>Stratejisi</w:t>
-      </w:r>
-      <w:proofErr w:type="spellEnd"/>
     </w:p>
     <w:p>
       <w:pPr>
@@ -4321,15 +4123,7 @@
         <w:spacing w:after="60"/>
       </w:pPr>
       <w:r>
-        <w:t>piyasa_</w:t>
-      </w:r>
-      <w:proofErr w:type="gramStart"/>
-      <w:r>
-        <w:t>verileri(</w:t>
-      </w:r>
-      <w:proofErr w:type="gramEnd"/>
-      <w:r>
-        <w:t>sembol, timestamp) — zaman serisi sorgular için bileşik indeks</w:t>
+        <w:t>piyasa_verileri(sembol, timestamp) — zaman serisi sorgular için bileşik indeks</w:t>
       </w:r>
     </w:p>
     <w:p>
@@ -4346,13 +4140,8 @@
         <w:pStyle w:val="ListeMaddemi"/>
         <w:spacing w:after="60"/>
       </w:pPr>
-      <w:proofErr w:type="gramStart"/>
       <w:r>
-        <w:t>haberler(</w:t>
-      </w:r>
-      <w:proofErr w:type="gramEnd"/>
-      <w:r>
-        <w:t>kaynak, yayinlanma_tarihi) — kategori ve tarih bazlı haber filtreleme</w:t>
+        <w:t>haberler(kaynak, yayinlanma_tarihi) — kategori ve tarih bazlı haber filtreleme</w:t>
       </w:r>
     </w:p>
     <w:p>
@@ -4361,15 +4150,7 @@
         <w:spacing w:after="60"/>
       </w:pPr>
       <w:r>
-        <w:t>chat_</w:t>
-      </w:r>
-      <w:proofErr w:type="gramStart"/>
-      <w:r>
-        <w:t>sessions(</w:t>
-      </w:r>
-      <w:proofErr w:type="gramEnd"/>
-      <w:r>
-        <w:t>kullanici_id, durum) — aktif oturum sorguları</w:t>
+        <w:t>chat_sessions(kullanici_id, durum) — aktif oturum sorguları</w:t>
       </w:r>
     </w:p>
     <w:p>
@@ -4378,15 +4159,7 @@
         <w:spacing w:after="60"/>
       </w:pPr>
       <w:r>
-        <w:t>chat_</w:t>
-      </w:r>
-      <w:proofErr w:type="gramStart"/>
-      <w:r>
-        <w:t>mesajlari(</w:t>
-      </w:r>
-      <w:proofErr w:type="gramEnd"/>
-      <w:r>
-        <w:t>seans_id, created_at) — kronolojik mesaj getirme</w:t>
+        <w:t>chat_mesajlari(seans_id, created_at) — kronolojik mesaj getirme</w:t>
       </w:r>
     </w:p>
     <w:p/>
@@ -5872,30 +5645,8 @@
         <w:rPr>
           <w:rFonts w:ascii="Arial" w:hAnsi="Arial"/>
         </w:rPr>
-        <w:t xml:space="preserve">5.3 API </w:t>
+        <w:t>5.3 API Yanıt Formatı</w:t>
       </w:r>
-      <w:proofErr w:type="spellStart"/>
-      <w:r>
-        <w:rPr>
-          <w:rFonts w:ascii="Arial" w:hAnsi="Arial"/>
-        </w:rPr>
-        <w:t>Yanıt</w:t>
-      </w:r>
-      <w:proofErr w:type="spellEnd"/>
-      <w:r>
-        <w:rPr>
-          <w:rFonts w:ascii="Arial" w:hAnsi="Arial"/>
-        </w:rPr>
-        <w:t xml:space="preserve"> </w:t>
-      </w:r>
-      <w:proofErr w:type="spellStart"/>
-      <w:r>
-        <w:rPr>
-          <w:rFonts w:ascii="Arial" w:hAnsi="Arial"/>
-        </w:rPr>
-        <w:t>Formatı</w:t>
-      </w:r>
-      <w:proofErr w:type="spellEnd"/>
     </w:p>
     <w:p>
       <w:pPr>
@@ -5909,42 +5660,12 @@
       <w:pPr>
         <w:spacing w:after="120"/>
       </w:pPr>
-      <w:proofErr w:type="gramStart"/>
       <w:r>
         <w:rPr>
           <w:b/>
         </w:rPr>
-        <w:t>{ "</w:t>
+        <w:t>{ "basarili": true, "veri": { ... }, "hata": null, "zaman": "2026-05-26T09:00:00Z" }</w:t>
       </w:r>
-      <w:proofErr w:type="gramEnd"/>
-      <w:r>
-        <w:rPr>
-          <w:b/>
-        </w:rPr>
-        <w:t xml:space="preserve">basarili": true, "veri": </w:t>
-      </w:r>
-      <w:proofErr w:type="gramStart"/>
-      <w:r>
-        <w:rPr>
-          <w:b/>
-        </w:rPr>
-        <w:t>{ ...</w:t>
-      </w:r>
-      <w:proofErr w:type="gramEnd"/>
-      <w:r>
-        <w:rPr>
-          <w:b/>
-        </w:rPr>
-        <w:t xml:space="preserve"> }, "hata": null, "zaman": "2026-05-26T09:00:00Z</w:t>
-      </w:r>
-      <w:proofErr w:type="gramStart"/>
-      <w:r>
-        <w:rPr>
-          <w:b/>
-        </w:rPr>
-        <w:t>" }</w:t>
-      </w:r>
-      <w:proofErr w:type="gramEnd"/>
     </w:p>
     <w:p>
       <w:pPr>
@@ -5955,19 +5676,10 @@
       </w:r>
     </w:p>
     <w:p>
-      <w:r>
-        <w:br w:type="page"/>
-      </w:r>
-    </w:p>
-    <w:p>
       <w:pPr>
         <w:pStyle w:val="Balk1"/>
       </w:pPr>
       <w:r>
-        <w:rPr>
-          <w:rFonts w:ascii="Arial" w:hAnsi="Arial"/>
-        </w:rPr>
-        <w:lastRenderedPageBreak/>
         <w:t>6. Güvenlik Mimarisi</w:t>
       </w:r>
     </w:p>
@@ -5979,7 +5691,13 @@
         <w:rPr>
           <w:rFonts w:ascii="Arial" w:hAnsi="Arial"/>
         </w:rPr>
-        <w:t>6.1 Kimlik Doğrulama Akışı</w:t>
+        <w:t>6</w:t>
+      </w:r>
+      <w:r>
+        <w:rPr>
+          <w:rFonts w:ascii="Arial" w:hAnsi="Arial"/>
+        </w:rPr>
+        <w:t>.1 Kimlik Doğrulama Akışı</w:t>
       </w:r>
     </w:p>
     <w:p>
@@ -6806,23 +6524,7 @@
                 <w:color w:val="auto"/>
                 <w:sz w:val="20"/>
               </w:rPr>
-              <w:t>market:</w:t>
-            </w:r>
-            <w:proofErr w:type="gramStart"/>
-            <w:r>
-              <w:rPr>
-                <w:color w:val="auto"/>
-                <w:sz w:val="20"/>
-              </w:rPr>
-              <w:t>data:{</w:t>
-            </w:r>
-            <w:proofErr w:type="gramEnd"/>
-            <w:r>
-              <w:rPr>
-                <w:color w:val="auto"/>
-                <w:sz w:val="20"/>
-              </w:rPr>
-              <w:t>sembol}</w:t>
+              <w:t>market:data:{sembol}</w:t>
             </w:r>
           </w:p>
         </w:tc>
@@ -6876,21 +6578,12 @@
                 <w:color w:val="auto"/>
               </w:rPr>
             </w:pPr>
-            <w:proofErr w:type="gramStart"/>
-            <w:r>
-              <w:rPr>
-                <w:color w:val="auto"/>
-                <w:sz w:val="20"/>
-              </w:rPr>
-              <w:t>news:list</w:t>
-            </w:r>
-            <w:proofErr w:type="gramEnd"/>
-            <w:r>
-              <w:rPr>
-                <w:color w:val="auto"/>
-                <w:sz w:val="20"/>
-              </w:rPr>
-              <w:t>:{sayfa}</w:t>
+            <w:r>
+              <w:rPr>
+                <w:color w:val="auto"/>
+                <w:sz w:val="20"/>
+              </w:rPr>
+              <w:t>news:list:{sayfa}</w:t>
             </w:r>
           </w:p>
         </w:tc>
@@ -6944,21 +6637,12 @@
                 <w:color w:val="auto"/>
               </w:rPr>
             </w:pPr>
-            <w:proofErr w:type="gramStart"/>
-            <w:r>
-              <w:rPr>
-                <w:color w:val="auto"/>
-                <w:sz w:val="20"/>
-              </w:rPr>
-              <w:t>portfolio:summary</w:t>
-            </w:r>
-            <w:proofErr w:type="gramEnd"/>
-            <w:r>
-              <w:rPr>
-                <w:color w:val="auto"/>
-                <w:sz w:val="20"/>
-              </w:rPr>
-              <w:t>:{kullaniciId}</w:t>
+            <w:r>
+              <w:rPr>
+                <w:color w:val="auto"/>
+                <w:sz w:val="20"/>
+              </w:rPr>
+              <w:t>portfolio:summary:{kullaniciId}</w:t>
             </w:r>
           </w:p>
         </w:tc>
@@ -7012,21 +6696,12 @@
                 <w:color w:val="auto"/>
               </w:rPr>
             </w:pPr>
-            <w:proofErr w:type="gramStart"/>
-            <w:r>
-              <w:rPr>
-                <w:color w:val="auto"/>
-                <w:sz w:val="20"/>
-              </w:rPr>
-              <w:t>ai:portfolio</w:t>
-            </w:r>
-            <w:proofErr w:type="gramEnd"/>
-            <w:r>
-              <w:rPr>
-                <w:color w:val="auto"/>
-                <w:sz w:val="20"/>
-              </w:rPr>
-              <w:t>:{kullaniciId}</w:t>
+            <w:r>
+              <w:rPr>
+                <w:color w:val="auto"/>
+                <w:sz w:val="20"/>
+              </w:rPr>
+              <w:t>ai:portfolio:{kullaniciId}</w:t>
             </w:r>
           </w:p>
         </w:tc>
@@ -7080,37 +6755,12 @@
                 <w:color w:val="auto"/>
               </w:rPr>
             </w:pPr>
-            <w:proofErr w:type="gramStart"/>
-            <w:r>
-              <w:rPr>
-                <w:color w:val="auto"/>
-                <w:sz w:val="20"/>
-              </w:rPr>
-              <w:t>rate:{</w:t>
-            </w:r>
-            <w:proofErr w:type="gramEnd"/>
-            <w:r>
-              <w:rPr>
-                <w:color w:val="auto"/>
-                <w:sz w:val="20"/>
-              </w:rPr>
-              <w:t>ip</w:t>
-            </w:r>
-            <w:proofErr w:type="gramStart"/>
-            <w:r>
-              <w:rPr>
-                <w:color w:val="auto"/>
-                <w:sz w:val="20"/>
-              </w:rPr>
-              <w:t>}:{</w:t>
-            </w:r>
-            <w:proofErr w:type="gramEnd"/>
-            <w:r>
-              <w:rPr>
-                <w:color w:val="auto"/>
-                <w:sz w:val="20"/>
-              </w:rPr>
-              <w:t>endpoint}</w:t>
+            <w:r>
+              <w:rPr>
+                <w:color w:val="auto"/>
+                <w:sz w:val="20"/>
+              </w:rPr>
+              <w:t>rate:{ip}:{endpoint}</w:t>
             </w:r>
           </w:p>
         </w:tc>
@@ -7238,13 +6888,7 @@
         <w:rPr>
           <w:rFonts w:ascii="Arial" w:hAnsi="Arial"/>
         </w:rPr>
-        <w:t>8</w:t>
-      </w:r>
-      <w:r>
-        <w:rPr>
-          <w:rFonts w:ascii="Arial" w:hAnsi="Arial"/>
-        </w:rPr>
-        <w:t>.1 Log Pipeline Mimarisi</w:t>
+        <w:t>8.1 Log Pipeline Mimarisi</w:t>
       </w:r>
     </w:p>
     <w:p>
@@ -7294,6 +6938,17 @@
     <w:p>
       <w:pPr>
         <w:pStyle w:val="Balk2"/>
+        <w:rPr>
+          <w:rFonts w:ascii="Arial" w:hAnsi="Arial"/>
+        </w:rPr>
+      </w:pPr>
+    </w:p>
+    <w:p>
+      <w:pPr>
+        <w:pStyle w:val="Balk2"/>
+        <w:rPr>
+          <w:rFonts w:ascii="Arial" w:hAnsi="Arial"/>
+        </w:rPr>
       </w:pPr>
       <w:r>
         <w:rPr>
@@ -7310,44 +6965,8 @@
         <w:rPr>
           <w:b/>
         </w:rPr>
-        <w:t xml:space="preserve">Tüm loglar JSON formatındadır: </w:t>
+        <w:t>Tüm loglar JSON formatındadır: { "level": "INFO", "logger": "com.finansportali...", "message": "...", "timestamp": "...", "traceId": "..." }</w:t>
       </w:r>
-      <w:proofErr w:type="gramStart"/>
-      <w:r>
-        <w:rPr>
-          <w:b/>
-        </w:rPr>
-        <w:t>{ "</w:t>
-      </w:r>
-      <w:proofErr w:type="gramEnd"/>
-      <w:r>
-        <w:rPr>
-          <w:b/>
-        </w:rPr>
-        <w:t>level": "INFO", "logger": "</w:t>
-      </w:r>
-      <w:proofErr w:type="gramStart"/>
-      <w:r>
-        <w:rPr>
-          <w:b/>
-        </w:rPr>
-        <w:t>com.finansportali</w:t>
-      </w:r>
-      <w:proofErr w:type="gramEnd"/>
-      <w:r>
-        <w:rPr>
-          <w:b/>
-        </w:rPr>
-        <w:t xml:space="preserve">...", "message": "...", "timestamp": "...", "traceId": </w:t>
-      </w:r>
-      <w:proofErr w:type="gramStart"/>
-      <w:r>
-        <w:rPr>
-          <w:b/>
-        </w:rPr>
-        <w:t>"..." }</w:t>
-      </w:r>
-      <w:proofErr w:type="gramEnd"/>
     </w:p>
     <w:p>
       <w:pPr>
@@ -7365,30 +6984,8 @@
         <w:rPr>
           <w:rFonts w:ascii="Arial" w:hAnsi="Arial"/>
         </w:rPr>
-        <w:t xml:space="preserve">8.3 </w:t>
+        <w:t>8.3 Metrik ve İzleme</w:t>
       </w:r>
-      <w:proofErr w:type="spellStart"/>
-      <w:r>
-        <w:rPr>
-          <w:rFonts w:ascii="Arial" w:hAnsi="Arial"/>
-        </w:rPr>
-        <w:t>Metrik</w:t>
-      </w:r>
-      <w:proofErr w:type="spellEnd"/>
-      <w:r>
-        <w:rPr>
-          <w:rFonts w:ascii="Arial" w:hAnsi="Arial"/>
-        </w:rPr>
-        <w:t xml:space="preserve"> ve </w:t>
-      </w:r>
-      <w:proofErr w:type="spellStart"/>
-      <w:r>
-        <w:rPr>
-          <w:rFonts w:ascii="Arial" w:hAnsi="Arial"/>
-        </w:rPr>
-        <w:t>İzleme</w:t>
-      </w:r>
-      <w:proofErr w:type="spellEnd"/>
     </w:p>
     <w:tbl>
       <w:tblPr>
@@ -7832,23 +7429,7 @@
                 <w:color w:val="auto"/>
                 <w:sz w:val="20"/>
               </w:rPr>
-              <w:t>${</w:t>
-            </w:r>
-            <w:proofErr w:type="gramStart"/>
-            <w:r>
-              <w:rPr>
-                <w:color w:val="auto"/>
-                <w:sz w:val="20"/>
-              </w:rPr>
-              <w:t>finans.api.gemini</w:t>
-            </w:r>
-            <w:proofErr w:type="gramEnd"/>
-            <w:r>
-              <w:rPr>
-                <w:color w:val="auto"/>
-                <w:sz w:val="20"/>
-              </w:rPr>
-              <w:t>.chat-key}</w:t>
+              <w:t>${finans.api.gemini.chat-key}</w:t>
             </w:r>
           </w:p>
         </w:tc>
@@ -7862,21 +7443,12 @@
                 <w:color w:val="auto"/>
               </w:rPr>
             </w:pPr>
-            <w:proofErr w:type="gramStart"/>
-            <w:r>
-              <w:rPr>
-                <w:color w:val="auto"/>
-                <w:sz w:val="20"/>
-              </w:rPr>
-              <w:t>tavsiyeAl(</w:t>
-            </w:r>
-            <w:proofErr w:type="gramEnd"/>
-            <w:r>
-              <w:rPr>
-                <w:color w:val="auto"/>
-                <w:sz w:val="20"/>
-              </w:rPr>
-              <w:t>) — Sohbet yanıtları</w:t>
+            <w:r>
+              <w:rPr>
+                <w:color w:val="auto"/>
+                <w:sz w:val="20"/>
+              </w:rPr>
+              <w:t>tavsiyeAl() — Sohbet yanıtları</w:t>
             </w:r>
           </w:p>
         </w:tc>
@@ -7916,23 +7488,7 @@
                 <w:color w:val="auto"/>
                 <w:sz w:val="20"/>
               </w:rPr>
-              <w:t>${</w:t>
-            </w:r>
-            <w:proofErr w:type="gramStart"/>
-            <w:r>
-              <w:rPr>
-                <w:color w:val="auto"/>
-                <w:sz w:val="20"/>
-              </w:rPr>
-              <w:t>finans.api.gemini</w:t>
-            </w:r>
-            <w:proofErr w:type="gramEnd"/>
-            <w:r>
-              <w:rPr>
-                <w:color w:val="auto"/>
-                <w:sz w:val="20"/>
-              </w:rPr>
-              <w:t>.portfolio-key}</w:t>
+              <w:t>${finans.api.gemini.portfolio-key}</w:t>
             </w:r>
           </w:p>
         </w:tc>
@@ -7946,21 +7502,12 @@
                 <w:color w:val="auto"/>
               </w:rPr>
             </w:pPr>
-            <w:proofErr w:type="gramStart"/>
-            <w:r>
-              <w:rPr>
-                <w:color w:val="auto"/>
-                <w:sz w:val="20"/>
-              </w:rPr>
-              <w:t>portfolioInsight(</w:t>
-            </w:r>
-            <w:proofErr w:type="gramEnd"/>
-            <w:r>
-              <w:rPr>
-                <w:color w:val="auto"/>
-                <w:sz w:val="20"/>
-              </w:rPr>
-              <w:t>) — Portföy analizi</w:t>
+            <w:r>
+              <w:rPr>
+                <w:color w:val="auto"/>
+                <w:sz w:val="20"/>
+              </w:rPr>
+              <w:t>portfolioInsight() — Portföy analizi</w:t>
             </w:r>
           </w:p>
         </w:tc>
@@ -8000,17 +7547,8 @@
                 <w:color w:val="auto"/>
                 <w:sz w:val="20"/>
               </w:rPr>
-              <w:t>${</w:t>
-            </w:r>
-            <w:proofErr w:type="gramStart"/>
-            <w:r>
-              <w:rPr>
-                <w:color w:val="auto"/>
-                <w:sz w:val="20"/>
-              </w:rPr>
-              <w:t>finans.api.gemini</w:t>
-            </w:r>
-            <w:proofErr w:type="gramEnd"/>
+              <w:t>${finans.api.gemini</w:t>
+            </w:r>
             <w:r>
               <w:rPr>
                 <w:color w:val="auto"/>
@@ -8030,21 +7568,12 @@
                 <w:color w:val="auto"/>
               </w:rPr>
             </w:pPr>
-            <w:proofErr w:type="gramStart"/>
-            <w:r>
-              <w:rPr>
-                <w:color w:val="auto"/>
-                <w:sz w:val="20"/>
-              </w:rPr>
-              <w:t>marketBriefing(</w:t>
-            </w:r>
-            <w:proofErr w:type="gramEnd"/>
-            <w:r>
-              <w:rPr>
-                <w:color w:val="auto"/>
-                <w:sz w:val="20"/>
-              </w:rPr>
-              <w:t>) — Günlük brifing</w:t>
+            <w:r>
+              <w:rPr>
+                <w:color w:val="auto"/>
+                <w:sz w:val="20"/>
+              </w:rPr>
+              <w:t>marketBriefing() — Günlük brifing</w:t>
             </w:r>
           </w:p>
         </w:tc>
@@ -8084,23 +7613,7 @@
                 <w:color w:val="auto"/>
                 <w:sz w:val="20"/>
               </w:rPr>
-              <w:t>${</w:t>
-            </w:r>
-            <w:proofErr w:type="gramStart"/>
-            <w:r>
-              <w:rPr>
-                <w:color w:val="auto"/>
-                <w:sz w:val="20"/>
-              </w:rPr>
-              <w:t>finans.api.gemini</w:t>
-            </w:r>
-            <w:proofErr w:type="gramEnd"/>
-            <w:r>
-              <w:rPr>
-                <w:color w:val="auto"/>
-                <w:sz w:val="20"/>
-              </w:rPr>
-              <w:t>.news-key}</w:t>
+              <w:t>${finans.api.gemini.news-key}</w:t>
             </w:r>
           </w:p>
         </w:tc>
@@ -8114,21 +7627,12 @@
                 <w:color w:val="auto"/>
               </w:rPr>
             </w:pPr>
-            <w:proofErr w:type="gramStart"/>
-            <w:r>
-              <w:rPr>
-                <w:color w:val="auto"/>
-                <w:sz w:val="20"/>
-              </w:rPr>
-              <w:t>haberOzetiOlustur(</w:t>
-            </w:r>
-            <w:proofErr w:type="gramEnd"/>
-            <w:r>
-              <w:rPr>
-                <w:color w:val="auto"/>
-                <w:sz w:val="20"/>
-              </w:rPr>
-              <w:t>) — Haber özeti (HaberAnalizService)</w:t>
+            <w:r>
+              <w:rPr>
+                <w:color w:val="auto"/>
+                <w:sz w:val="20"/>
+              </w:rPr>
+              <w:t>haberOzetiOlustur() — Haber özeti (HaberAnalizService)</w:t>
             </w:r>
           </w:p>
         </w:tc>
@@ -8169,13 +7673,8 @@
         <w:pStyle w:val="ListeNumaras"/>
         <w:spacing w:after="60"/>
       </w:pPr>
-      <w:proofErr w:type="gramStart"/>
       <w:r>
-        <w:t>aiYanitAyikla(</w:t>
-      </w:r>
-      <w:proofErr w:type="gramEnd"/>
-      <w:r>
-        <w:t>) metodu regex ile JSON bloğunu ayıklar</w:t>
+        <w:t>aiYanitAyikla() metodu regex ile JSON bloğunu ayıklar</w:t>
       </w:r>
     </w:p>
     <w:p>
@@ -8201,11 +7700,9 @@
         <w:pStyle w:val="ListeNumaras"/>
         <w:spacing w:after="60"/>
       </w:pPr>
-      <w:proofErr w:type="gramStart"/>
       <w:r>
         <w:t>seceneklerOlustur(</w:t>
       </w:r>
-      <w:proofErr w:type="gramEnd"/>
       <w:r>
         <w:t>) metodu yanıt içeriğine göre 3 öneri butonu üretir</w:t>
       </w:r>
@@ -8276,18 +7773,10 @@
       </w:r>
     </w:p>
     <w:p>
-      <w:r>
-        <w:br w:type="page"/>
-      </w:r>
-    </w:p>
-    <w:p>
       <w:pPr>
         <w:pStyle w:val="Balk1"/>
       </w:pPr>
       <w:r>
-        <w:rPr>
-          <w:rFonts w:ascii="Arial" w:hAnsi="Arial"/>
-        </w:rPr>
         <w:lastRenderedPageBreak/>
         <w:t>10. Test Stratejisi</w:t>
       </w:r>
@@ -8300,7 +7789,13 @@
         <w:rPr>
           <w:rFonts w:ascii="Arial" w:hAnsi="Arial"/>
         </w:rPr>
-        <w:t>10.1 Test Piramidi</w:t>
+        <w:t>1</w:t>
+      </w:r>
+      <w:r>
+        <w:rPr>
+          <w:rFonts w:ascii="Arial" w:hAnsi="Arial"/>
+        </w:rPr>
+        <w:t>0.1 Test Piramidi</w:t>
       </w:r>
     </w:p>
     <w:tbl>
@@ -9482,18 +8977,13 @@
     </w:tbl>
     <w:p/>
     <w:p>
-      <w:r>
-        <w:br w:type="page"/>
-      </w:r>
-    </w:p>
-    <w:p>
       <w:pPr>
         <w:pStyle w:val="Balk1"/>
       </w:pPr>
       <w:r>
-        <w:rPr>
-          <w:rFonts w:ascii="Arial" w:hAnsi="Arial"/>
-        </w:rPr>
+        <w:br w:type="page"/>
+      </w:r>
+      <w:r>
         <w:lastRenderedPageBreak/>
         <w:t>12. Sonuç</w:t>
       </w:r>
@@ -9503,7 +8993,10 @@
         <w:spacing w:after="120"/>
       </w:pPr>
       <w:r>
-        <w:t>Bu teknik analiz dökümanı, Finansal Yatırım Takip Portalı'nın mimari ve tasarım kararlarını kapsamlı biçimde belgelemiştir. Projenin teknik olgunluğu şu başlıklarda öne çıkmaktadır:</w:t>
+        <w:t>B</w:t>
+      </w:r>
+      <w:r>
+        <w:t>u teknik analiz dökümanı, Finansal Yatırım Takip Portalı'nın mimari ve tasarım kararlarını kapsamlı biçimde belgelemiştir. Projenin teknik olgunluğu şu başlıklarda öne çıkmaktadır:</w:t>
       </w:r>
     </w:p>
     <w:p>

</xml_diff>